<commit_message>
Sync docs with updated prototype and regenerate vision document
- docs/index.html: synced with latest prototype (client assignments, Elena reassign UI, auto-provider)
- docs/RCH_CRM_System_Vision.docx: regenerated with updated content
- Section 4.2 renamed to "Client Assignment to Account Managers" — explains per-AM client lists and Elena's one-click reassign
- New Section 4.3 "Clients Across Both Companies" — reflects that company is now auto-determined from client profile, no manual AM selection
- Section 4.4 (was 4.3) Custom Invoice Requirements renumbered accordingly
- Section 5.2 service logging bullet updated: AM selects client from their personal list; company auto-fills with colour indicator
- scripts/generate_document.js: fixed asset paths to use repo-relative paths so the script works from any machine

https://claude.ai/code/session_01MAF2x78K8ZVcJaT2K8Jn8J
</commit_message>
<xml_diff>
--- a/docs/RCH_CRM_System_Vision.docx
+++ b/docs/RCH_CRM_System_Vision.docx
@@ -863,21 +863,21 @@
         <w:pStyle w:val="Heading2"/>
       </w:pPr>
       <w:r>
-        <w:t xml:space="preserve">4.2 Clients Across Both Companies</w:t>
-      </w:r>
-    </w:p>
-    <w:p>
-      <w:pPr>
-        <w:spacing w:after="180" w:line="320"/>
-      </w:pPr>
-      <w:r>
-        <w:rPr>
-          <w:rFonts w:ascii="Arial" w:cs="Arial" w:eastAsia="Arial" w:hAnsi="Arial"/>
-          <w:color w:val="333333"/>
-          <w:sz w:val="22"/>
-          <w:szCs w:val="22"/>
-        </w:rPr>
-        <w:t xml:space="preserve">Some clients may have services that fall under Rapid and services that fall under RCHBS. The system handles this by letting the AM choose the company each time a service is logged. The client profile exists once in the system, but individual services are assigned to the correct company. Invoices are generated per company — a client with services under both Rapid and RCHBS will receive separate invoices from each.</w:t>
+        <w:t xml:space="preserve">4.2 Client Assignment to Account Managers</w:t>
+      </w:r>
+    </w:p>
+    <w:p>
+      <w:pPr>
+        <w:spacing w:after="180" w:line="320"/>
+      </w:pPr>
+      <w:r>
+        <w:rPr>
+          <w:rFonts w:ascii="Arial" w:cs="Arial" w:eastAsia="Arial" w:hAnsi="Arial"/>
+          <w:color w:val="333333"/>
+          <w:sz w:val="22"/>
+          <w:szCs w:val="22"/>
+        </w:rPr>
+        <w:t xml:space="preserve">Every client in the system is assigned to one Account Manager. When an AM logs into the system, they only see the clients assigned to them — this keeps each AM’s workspace clean and focused. The AM Team Leader (Elena) can reassign any client to a different AM directly from the client list with a single click, without needing to open the full client profile.</w:t>
       </w:r>
     </w:p>
     <w:p>
@@ -885,7 +885,29 @@
         <w:pStyle w:val="Heading2"/>
       </w:pPr>
       <w:r>
-        <w:t xml:space="preserve">4.3 Custom Invoice Requirements</w:t>
+        <w:t xml:space="preserve">4.3 Clients Across Both Companies</w:t>
+      </w:r>
+    </w:p>
+    <w:p>
+      <w:pPr>
+        <w:spacing w:after="180" w:line="320"/>
+      </w:pPr>
+      <w:r>
+        <w:rPr>
+          <w:rFonts w:ascii="Arial" w:cs="Arial" w:eastAsia="Arial" w:hAnsi="Arial"/>
+          <w:color w:val="333333"/>
+          <w:sz w:val="22"/>
+          <w:szCs w:val="22"/>
+        </w:rPr>
+        <w:t xml:space="preserve">Each client profile has a primary company — either Rapid Clearing House or RCH Business Solutions (RCHBS). When an Account Manager logs a service for a client, the system automatically uses that client’s company to determine the correct price list and which credit cards are available for the government fee. There is no manual company selection during service logging; the correct company is set from the client profile and confirmed to the AM via a colour-coded indicator on the form. Invoices are always generated under the company the service was logged against.</w:t>
+      </w:r>
+    </w:p>
+    <w:p>
+      <w:pPr>
+        <w:pStyle w:val="Heading2"/>
+      </w:pPr>
+      <w:r>
+        <w:t xml:space="preserve">4.4 Custom Invoice Requirements</w:t>
       </w:r>
     </w:p>
     <w:p>
@@ -1287,45 +1309,26 @@
           <w:sz w:val="22"/>
           <w:szCs w:val="22"/>
         </w:rPr>
-        <w:t xml:space="preserve">The client (selected from the list, or created if new)</w:t>
-      </w:r>
-    </w:p>
-    <w:p>
-      <w:pPr>
-        <w:pStyle w:val="ListParagraph"/>
-        <w:numPr>
-          <w:ilvl w:val="0"/>
-          <w:numId w:val="2"/>
-        </w:numPr>
-        <w:spacing w:after="100" w:line="300"/>
-      </w:pPr>
-      <w:r>
-        <w:rPr>
-          <w:rFonts w:ascii="Arial" w:cs="Arial" w:eastAsia="Arial" w:hAnsi="Arial"/>
-          <w:color w:val="333333"/>
-          <w:sz w:val="22"/>
-          <w:szCs w:val="22"/>
-        </w:rPr>
-        <w:t xml:space="preserve">The company this service falls under (Rapid or RCHBS)</w:t>
-      </w:r>
-    </w:p>
-    <w:p>
-      <w:pPr>
-        <w:pStyle w:val="ListParagraph"/>
-        <w:numPr>
-          <w:ilvl w:val="0"/>
-          <w:numId w:val="2"/>
-        </w:numPr>
-        <w:spacing w:after="100" w:line="300"/>
-      </w:pPr>
-      <w:r>
-        <w:rPr>
-          <w:rFonts w:ascii="Arial" w:cs="Arial" w:eastAsia="Arial" w:hAnsi="Arial"/>
-          <w:color w:val="333333"/>
-          <w:sz w:val="22"/>
-          <w:szCs w:val="22"/>
-        </w:rPr>
-        <w:t xml:space="preserve">The type of service (selected from a list — e.g. QID Renewal, Gate Passes, Company Documents Amendment, Visa Issuance)</w:t>
+        <w:t xml:space="preserve">The client (selected from their personal client list — each AM only sees the clients assigned to them)</w:t>
+      </w:r>
+    </w:p>
+    <w:p>
+      <w:pPr>
+        <w:pStyle w:val="ListParagraph"/>
+        <w:numPr>
+          <w:ilvl w:val="0"/>
+          <w:numId w:val="2"/>
+        </w:numPr>
+        <w:spacing w:after="100" w:line="300"/>
+      </w:pPr>
+      <w:r>
+        <w:rPr>
+          <w:rFonts w:ascii="Arial" w:cs="Arial" w:eastAsia="Arial" w:hAnsi="Arial"/>
+          <w:color w:val="333333"/>
+          <w:sz w:val="22"/>
+          <w:szCs w:val="22"/>
+        </w:rPr>
+        <w:t xml:space="preserve">The type of service (selected from a list — e.g. QID Renewal, Gate Passes, Company Documents Amendment, Visa Issuance). Once the client is selected, the system automatically determines whether this is a Rapid or RCHBS service based on the client’s profile and shows this as a colour-coded indicator.</w:t>
       </w:r>
     </w:p>
     <w:p>

</xml_diff>

<commit_message>
Update vision document to v0.6.0 with new sections and feature changes
- Section 4: expand client onboarding wizard with all fields (CR, P.O. Box, credit limit, etc.)
- Section 6: add Elena bypass exception for Finance/TL completing services
- Section 7: add invoice approval workflow (pending_approval → approved/rejected)
- Section 9: update card management with dynamic CRUD, per-card transaction ledgers
- Section 15: redesign Gabi dashboard description (Card Health summary with dot indicators)
- Section 16 (new): Permissions and Role Management — tag-based permission model, role CRUD, per-user overrides
- Section 17: Glossary expanded with 5 new terms (Permission Tag, Role Management, Invoice Approval, Transaction Ledger, Client Onboarding)
- README: update document section table to 17 sections

https://claude.ai/code/session_016sQyp4VzPtMCNa1wsuAQVy
</commit_message>
<xml_diff>
--- a/docs/RCH_CRM_System_Vision.docx
+++ b/docs/RCH_CRM_System_Vision.docx
@@ -702,102 +702,197 @@
           <w:sz w:val="22"/>
           <w:szCs w:val="22"/>
         </w:rPr>
-        <w:t xml:space="preserve">When an Account Manager creates a new client, the system collects the following information:</w:t>
-      </w:r>
-    </w:p>
-    <w:p>
-      <w:pPr>
-        <w:pStyle w:val="ListParagraph"/>
-        <w:numPr>
-          <w:ilvl w:val="0"/>
-          <w:numId w:val="2"/>
-        </w:numPr>
-        <w:spacing w:after="100" w:line="300"/>
-      </w:pPr>
-      <w:r>
-        <w:rPr>
-          <w:rFonts w:ascii="Arial" w:cs="Arial" w:eastAsia="Arial" w:hAnsi="Arial"/>
-          <w:color w:val="333333"/>
-          <w:sz w:val="22"/>
-          <w:szCs w:val="22"/>
-        </w:rPr>
-        <w:t xml:space="preserve">Company name</w:t>
-      </w:r>
-    </w:p>
-    <w:p>
-      <w:pPr>
-        <w:pStyle w:val="ListParagraph"/>
-        <w:numPr>
-          <w:ilvl w:val="0"/>
-          <w:numId w:val="2"/>
-        </w:numPr>
-        <w:spacing w:after="100" w:line="300"/>
-      </w:pPr>
-      <w:r>
-        <w:rPr>
-          <w:rFonts w:ascii="Arial" w:cs="Arial" w:eastAsia="Arial" w:hAnsi="Arial"/>
-          <w:color w:val="333333"/>
-          <w:sz w:val="22"/>
-          <w:szCs w:val="22"/>
-        </w:rPr>
-        <w:t xml:space="preserve">Contact person name</w:t>
-      </w:r>
-    </w:p>
-    <w:p>
-      <w:pPr>
-        <w:pStyle w:val="ListParagraph"/>
-        <w:numPr>
-          <w:ilvl w:val="0"/>
-          <w:numId w:val="2"/>
-        </w:numPr>
-        <w:spacing w:after="100" w:line="300"/>
-      </w:pPr>
-      <w:r>
-        <w:rPr>
-          <w:rFonts w:ascii="Arial" w:cs="Arial" w:eastAsia="Arial" w:hAnsi="Arial"/>
-          <w:color w:val="333333"/>
-          <w:sz w:val="22"/>
-          <w:szCs w:val="22"/>
-        </w:rPr>
-        <w:t xml:space="preserve">Email address and phone number</w:t>
-      </w:r>
-    </w:p>
-    <w:p>
-      <w:pPr>
-        <w:pStyle w:val="ListParagraph"/>
-        <w:numPr>
-          <w:ilvl w:val="0"/>
-          <w:numId w:val="2"/>
-        </w:numPr>
-        <w:spacing w:after="100" w:line="300"/>
-      </w:pPr>
-      <w:r>
-        <w:rPr>
-          <w:rFonts w:ascii="Arial" w:cs="Arial" w:eastAsia="Arial" w:hAnsi="Arial"/>
-          <w:color w:val="333333"/>
-          <w:sz w:val="22"/>
-          <w:szCs w:val="22"/>
-        </w:rPr>
-        <w:t xml:space="preserve">Location (city, country)</w:t>
-      </w:r>
-    </w:p>
-    <w:p>
-      <w:pPr>
-        <w:pStyle w:val="ListParagraph"/>
-        <w:numPr>
-          <w:ilvl w:val="0"/>
-          <w:numId w:val="2"/>
-        </w:numPr>
-        <w:spacing w:after="100" w:line="300"/>
-      </w:pPr>
-      <w:r>
-        <w:rPr>
-          <w:rFonts w:ascii="Arial" w:cs="Arial" w:eastAsia="Arial" w:hAnsi="Arial"/>
-          <w:color w:val="333333"/>
-          <w:sz w:val="22"/>
-          <w:szCs w:val="22"/>
-        </w:rPr>
-        <w:t xml:space="preserve">Any special invoicing dates or payment terms</w:t>
+        <w:t xml:space="preserve">The system provides a step-by-step onboarding wizard that guides the Account Manager through the process. The wizard collects the following information:</w:t>
+      </w:r>
+    </w:p>
+    <w:p>
+      <w:pPr>
+        <w:pStyle w:val="ListParagraph"/>
+        <w:numPr>
+          <w:ilvl w:val="0"/>
+          <w:numId w:val="2"/>
+        </w:numPr>
+        <w:spacing w:after="100" w:line="300"/>
+      </w:pPr>
+      <w:r>
+        <w:rPr>
+          <w:rFonts w:ascii="Arial" w:cs="Arial" w:eastAsia="Arial" w:hAnsi="Arial"/>
+          <w:color w:val="333333"/>
+          <w:sz w:val="22"/>
+          <w:szCs w:val="22"/>
+        </w:rPr>
+        <w:t xml:space="preserve">Company name and nickname (short name used in daily communication)</w:t>
+      </w:r>
+    </w:p>
+    <w:p>
+      <w:pPr>
+        <w:pStyle w:val="ListParagraph"/>
+        <w:numPr>
+          <w:ilvl w:val="0"/>
+          <w:numId w:val="2"/>
+        </w:numPr>
+        <w:spacing w:after="100" w:line="300"/>
+      </w:pPr>
+      <w:r>
+        <w:rPr>
+          <w:rFonts w:ascii="Arial" w:cs="Arial" w:eastAsia="Arial" w:hAnsi="Arial"/>
+          <w:color w:val="333333"/>
+          <w:sz w:val="22"/>
+          <w:szCs w:val="22"/>
+        </w:rPr>
+        <w:t xml:space="preserve">Which RCH entity the client falls under (Rapid or RCHBS)</w:t>
+      </w:r>
+    </w:p>
+    <w:p>
+      <w:pPr>
+        <w:pStyle w:val="ListParagraph"/>
+        <w:numPr>
+          <w:ilvl w:val="0"/>
+          <w:numId w:val="2"/>
+        </w:numPr>
+        <w:spacing w:after="100" w:line="300"/>
+      </w:pPr>
+      <w:r>
+        <w:rPr>
+          <w:rFonts w:ascii="Arial" w:cs="Arial" w:eastAsia="Arial" w:hAnsi="Arial"/>
+          <w:color w:val="333333"/>
+          <w:sz w:val="22"/>
+          <w:szCs w:val="22"/>
+        </w:rPr>
+        <w:t xml:space="preserve">Contact person name, email address, and phone number</w:t>
+      </w:r>
+    </w:p>
+    <w:p>
+      <w:pPr>
+        <w:pStyle w:val="ListParagraph"/>
+        <w:numPr>
+          <w:ilvl w:val="0"/>
+          <w:numId w:val="2"/>
+        </w:numPr>
+        <w:spacing w:after="100" w:line="300"/>
+      </w:pPr>
+      <w:r>
+        <w:rPr>
+          <w:rFonts w:ascii="Arial" w:cs="Arial" w:eastAsia="Arial" w:hAnsi="Arial"/>
+          <w:color w:val="333333"/>
+          <w:sz w:val="22"/>
+          <w:szCs w:val="22"/>
+        </w:rPr>
+        <w:t xml:space="preserve">Location: street address, city, country, and P.O. Box</w:t>
+      </w:r>
+    </w:p>
+    <w:p>
+      <w:pPr>
+        <w:pStyle w:val="ListParagraph"/>
+        <w:numPr>
+          <w:ilvl w:val="0"/>
+          <w:numId w:val="2"/>
+        </w:numPr>
+        <w:spacing w:after="100" w:line="300"/>
+      </w:pPr>
+      <w:r>
+        <w:rPr>
+          <w:rFonts w:ascii="Arial" w:cs="Arial" w:eastAsia="Arial" w:hAnsi="Arial"/>
+          <w:color w:val="333333"/>
+          <w:sz w:val="22"/>
+          <w:szCs w:val="22"/>
+        </w:rPr>
+        <w:t xml:space="preserve">Commercial Registration (CR) number</w:t>
+      </w:r>
+    </w:p>
+    <w:p>
+      <w:pPr>
+        <w:pStyle w:val="ListParagraph"/>
+        <w:numPr>
+          <w:ilvl w:val="0"/>
+          <w:numId w:val="2"/>
+        </w:numPr>
+        <w:spacing w:after="100" w:line="300"/>
+      </w:pPr>
+      <w:r>
+        <w:rPr>
+          <w:rFonts w:ascii="Arial" w:cs="Arial" w:eastAsia="Arial" w:hAnsi="Arial"/>
+          <w:color w:val="333333"/>
+          <w:sz w:val="22"/>
+          <w:szCs w:val="22"/>
+        </w:rPr>
+        <w:t xml:space="preserve">Client type: retainer or per-job</w:t>
+      </w:r>
+    </w:p>
+    <w:p>
+      <w:pPr>
+        <w:pStyle w:val="ListParagraph"/>
+        <w:numPr>
+          <w:ilvl w:val="0"/>
+          <w:numId w:val="2"/>
+        </w:numPr>
+        <w:spacing w:after="100" w:line="300"/>
+      </w:pPr>
+      <w:r>
+        <w:rPr>
+          <w:rFonts w:ascii="Arial" w:cs="Arial" w:eastAsia="Arial" w:hAnsi="Arial"/>
+          <w:color w:val="333333"/>
+          <w:sz w:val="22"/>
+          <w:szCs w:val="22"/>
+        </w:rPr>
+        <w:t xml:space="preserve">Credit limit (the maximum uninvoiced spending allowed before invoicing is triggered)</w:t>
+      </w:r>
+    </w:p>
+    <w:p>
+      <w:pPr>
+        <w:pStyle w:val="ListParagraph"/>
+        <w:numPr>
+          <w:ilvl w:val="0"/>
+          <w:numId w:val="2"/>
+        </w:numPr>
+        <w:spacing w:after="100" w:line="300"/>
+      </w:pPr>
+      <w:r>
+        <w:rPr>
+          <w:rFonts w:ascii="Arial" w:cs="Arial" w:eastAsia="Arial" w:hAnsi="Arial"/>
+          <w:color w:val="333333"/>
+          <w:sz w:val="22"/>
+          <w:szCs w:val="22"/>
+        </w:rPr>
+        <w:t xml:space="preserve">Assigned Account Manager</w:t>
+      </w:r>
+    </w:p>
+    <w:p>
+      <w:pPr>
+        <w:pStyle w:val="ListParagraph"/>
+        <w:numPr>
+          <w:ilvl w:val="0"/>
+          <w:numId w:val="2"/>
+        </w:numPr>
+        <w:spacing w:after="100" w:line="300"/>
+      </w:pPr>
+      <w:r>
+        <w:rPr>
+          <w:rFonts w:ascii="Arial" w:cs="Arial" w:eastAsia="Arial" w:hAnsi="Arial"/>
+          <w:color w:val="333333"/>
+          <w:sz w:val="22"/>
+          <w:szCs w:val="22"/>
+        </w:rPr>
+        <w:t xml:space="preserve">Contract start and end dates</w:t>
+      </w:r>
+    </w:p>
+    <w:p>
+      <w:pPr>
+        <w:pStyle w:val="ListParagraph"/>
+        <w:numPr>
+          <w:ilvl w:val="0"/>
+          <w:numId w:val="2"/>
+        </w:numPr>
+        <w:spacing w:after="100" w:line="300"/>
+      </w:pPr>
+      <w:r>
+        <w:rPr>
+          <w:rFonts w:ascii="Arial" w:cs="Arial" w:eastAsia="Arial" w:hAnsi="Arial"/>
+          <w:color w:val="333333"/>
+          <w:sz w:val="22"/>
+          <w:szCs w:val="22"/>
+        </w:rPr>
+        <w:t xml:space="preserve">Invoicing preference (weekly Thursday cycle, spending limit triggered, or custom schedule)</w:t>
       </w:r>
     </w:p>
     <w:p>
@@ -1680,467 +1775,6 @@
     </w:p>
     <w:p>
       <w:pPr>
-        <w:pStyle w:val="Heading2"/>
-      </w:pPr>
-      <w:r>
-        <w:t xml:space="preserve">5.6 Step 6: Gabi Verifies the Payment</w:t>
-      </w:r>
-    </w:p>
-    <w:p>
-      <w:pPr>
-        <w:spacing w:after="180" w:line="320"/>
-      </w:pPr>
-      <w:r>
-        <w:rPr>
-          <w:rFonts w:ascii="Arial" w:cs="Arial" w:eastAsia="Arial" w:hAnsi="Arial"/>
-          <w:color w:val="333333"/>
-          <w:sz w:val="22"/>
-          <w:szCs w:val="22"/>
-        </w:rPr>
-        <w:t xml:space="preserve">After Elena’s approval, the submission goes to Gabi for payment verification. Gabi checks her phone for the SMS bank alerts to confirm that the payment actually happened on the correct card for the correct amount. This step ensures that what was entered into the system matches what actually happened at the bank level.</w:t>
-      </w:r>
-    </w:p>
-    <w:p>
-      <w:pPr>
-        <w:spacing w:after="180" w:line="320"/>
-      </w:pPr>
-      <w:r>
-        <w:rPr>
-          <w:rFonts w:ascii="Arial" w:cs="Arial" w:eastAsia="Arial" w:hAnsi="Arial"/>
-          <w:color w:val="333333"/>
-          <w:sz w:val="22"/>
-          <w:szCs w:val="22"/>
-        </w:rPr>
-        <w:t xml:space="preserve">This is an important change from the current process. Today, Gabi’s verification happens later, during invoice creation, which means problems are caught late and cause delays. In the new system, Gabi’s check happens immediately after the service is completed, so any issues are caught early and do not delay Thursday invoicing.</w:t>
-      </w:r>
-    </w:p>
-    <w:p>
-      <w:pPr>
-        <w:pStyle w:val="Heading2"/>
-      </w:pPr>
-      <w:r>
-        <w:t xml:space="preserve">5.7 Service Status: Verified</w:t>
-      </w:r>
-    </w:p>
-    <w:p>
-      <w:pPr>
-        <w:spacing w:after="180" w:line="320"/>
-      </w:pPr>
-      <w:r>
-        <w:rPr>
-          <w:rFonts w:ascii="Arial" w:cs="Arial" w:eastAsia="Arial" w:hAnsi="Arial"/>
-          <w:color w:val="333333"/>
-          <w:sz w:val="22"/>
-          <w:szCs w:val="22"/>
-        </w:rPr>
-        <w:t xml:space="preserve">Once both Elena and Gabi have approved, the service is marked as “Verified” in the system. At this point:</w:t>
-      </w:r>
-    </w:p>
-    <w:p>
-      <w:pPr>
-        <w:pStyle w:val="ListParagraph"/>
-        <w:numPr>
-          <w:ilvl w:val="0"/>
-          <w:numId w:val="2"/>
-        </w:numPr>
-        <w:spacing w:after="100" w:line="300"/>
-      </w:pPr>
-      <w:r>
-        <w:rPr>
-          <w:rFonts w:ascii="Arial" w:cs="Arial" w:eastAsia="Arial" w:hAnsi="Arial"/>
-          <w:color w:val="333333"/>
-          <w:sz w:val="22"/>
-          <w:szCs w:val="22"/>
-        </w:rPr>
-        <w:t xml:space="preserve">The service appears on the Finance Department’s dashboard as ready to be invoiced</w:t>
-      </w:r>
-    </w:p>
-    <w:p>
-      <w:pPr>
-        <w:pStyle w:val="ListParagraph"/>
-        <w:numPr>
-          <w:ilvl w:val="0"/>
-          <w:numId w:val="2"/>
-        </w:numPr>
-        <w:spacing w:after="100" w:line="300"/>
-      </w:pPr>
-      <w:r>
-        <w:rPr>
-          <w:rFonts w:ascii="Arial" w:cs="Arial" w:eastAsia="Arial" w:hAnsi="Arial"/>
-          <w:color w:val="333333"/>
-          <w:sz w:val="22"/>
-          <w:szCs w:val="22"/>
-        </w:rPr>
-        <w:t xml:space="preserve">The client’s running spending total is updated automatically</w:t>
-      </w:r>
-    </w:p>
-    <w:p>
-      <w:pPr>
-        <w:pStyle w:val="ListParagraph"/>
-        <w:numPr>
-          <w:ilvl w:val="0"/>
-          <w:numId w:val="2"/>
-        </w:numPr>
-        <w:spacing w:after="100" w:line="300"/>
-      </w:pPr>
-      <w:r>
-        <w:rPr>
-          <w:rFonts w:ascii="Arial" w:cs="Arial" w:eastAsia="Arial" w:hAnsi="Arial"/>
-          <w:color w:val="333333"/>
-          <w:sz w:val="22"/>
-          <w:szCs w:val="22"/>
-        </w:rPr>
-        <w:t xml:space="preserve">The system checks the client’s spending limit and shows a warning if they are near or over</w:t>
-      </w:r>
-    </w:p>
-    <w:p>
-      <w:pPr>
-        <w:pStyle w:val="ListParagraph"/>
-        <w:numPr>
-          <w:ilvl w:val="0"/>
-          <w:numId w:val="2"/>
-        </w:numPr>
-        <w:spacing w:after="100" w:line="300"/>
-      </w:pPr>
-      <w:r>
-        <w:rPr>
-          <w:rFonts w:ascii="Arial" w:cs="Arial" w:eastAsia="Arial" w:hAnsi="Arial"/>
-          <w:color w:val="333333"/>
-          <w:sz w:val="22"/>
-          <w:szCs w:val="22"/>
-        </w:rPr>
-        <w:t xml:space="preserve">The transaction is visible on the real-time dashboard for all roles</w:t>
-      </w:r>
-    </w:p>
-    <w:p>
-      <w:pPr>
-        <w:pStyle w:val="Heading1"/>
-      </w:pPr>
-      <w:r>
-        <w:t xml:space="preserve">7. Invoicing</w:t>
-      </w:r>
-    </w:p>
-    <w:p>
-      <w:pPr>
-        <w:spacing w:after="180" w:line="320"/>
-      </w:pPr>
-      <w:r>
-        <w:rPr>
-          <w:rFonts w:ascii="Arial" w:cs="Arial" w:eastAsia="Arial" w:hAnsi="Arial"/>
-          <w:color w:val="333333"/>
-          <w:sz w:val="22"/>
-          <w:szCs w:val="22"/>
-        </w:rPr>
-        <w:t xml:space="preserve">Invoicing is the most important process for the Finance Department. The new system changes it from a manual, paper-based task into a fast, mostly automated process with just two steps: choose the client, and choose the services. There are three types of invoices.</w:t>
-      </w:r>
-    </w:p>
-    <w:p>
-      <w:pPr>
-        <w:pStyle w:val="Heading2"/>
-      </w:pPr>
-      <w:r>
-        <w:t xml:space="preserve">6.1 Weekly Service Invoices (Every Thursday)</w:t>
-      </w:r>
-    </w:p>
-    <w:p>
-      <w:pPr>
-        <w:pStyle w:val="Heading3"/>
-      </w:pPr>
-      <w:r>
-        <w:t xml:space="preserve">Invoice Triggers</w:t>
-      </w:r>
-    </w:p>
-    <w:p>
-      <w:pPr>
-        <w:spacing w:after="180" w:line="320"/>
-      </w:pPr>
-      <w:r>
-        <w:rPr>
-          <w:rFonts w:ascii="Arial" w:cs="Arial" w:eastAsia="Arial" w:hAnsi="Arial"/>
-          <w:color w:val="333333"/>
-          <w:sz w:val="22"/>
-          <w:szCs w:val="22"/>
-        </w:rPr>
-        <w:t xml:space="preserve">Thursday is the standard invoicing day. However, the system also triggers invoicing in two other cases: when a client hits their spending limit (Finance should invoice immediately rather than wait), and when a verified service has been sitting uninvoiced for more than approximately 20 days (the system shows a persistent alert until it is dealt with).</w:t>
-      </w:r>
-    </w:p>
-    <w:p>
-      <w:pPr>
-        <w:pStyle w:val="Heading3"/>
-      </w:pPr>
-      <w:r>
-        <w:t xml:space="preserve">What Finance Sees on Thursday</w:t>
-      </w:r>
-    </w:p>
-    <w:p>
-      <w:pPr>
-        <w:spacing w:after="180" w:line="320"/>
-      </w:pPr>
-      <w:r>
-        <w:rPr>
-          <w:rFonts w:ascii="Arial" w:cs="Arial" w:eastAsia="Arial" w:hAnsi="Arial"/>
-          <w:color w:val="333333"/>
-          <w:sz w:val="22"/>
-          <w:szCs w:val="22"/>
-        </w:rPr>
-        <w:t xml:space="preserve">The Finance Department opens the CRM and sees a dashboard of all verified services that have not yet been invoiced. The dashboard is sorted so that clients with the highest total government fees appear at the top — this helps Finance prioritize the most important invoices first. Services are grouped by client, showing the total amount of uninvoiced government fees per client.</w:t>
-      </w:r>
-    </w:p>
-    <w:p>
-      <w:pPr>
-        <w:pStyle w:val="Heading3"/>
-      </w:pPr>
-      <w:r>
-        <w:t xml:space="preserve">Creating an Invoice: Two Steps</w:t>
-      </w:r>
-    </w:p>
-    <w:p>
-      <w:pPr>
-        <w:spacing w:after="180" w:line="320"/>
-      </w:pPr>
-      <w:r>
-        <w:rPr>
-          <w:rFonts w:ascii="Arial" w:cs="Arial" w:eastAsia="Arial" w:hAnsi="Arial"/>
-          <w:color w:val="333333"/>
-          <w:sz w:val="22"/>
-          <w:szCs w:val="22"/>
-        </w:rPr>
-        <w:t xml:space="preserve">The Finance Department selects a client from the dashboard. The system shows all uninvoiced services for that client. Finance picks which services to include (they can select all of them or just some). The system then generates a draft invoice automatically. It fills in everything:</w:t>
-      </w:r>
-    </w:p>
-    <w:p>
-      <w:pPr>
-        <w:pStyle w:val="ListParagraph"/>
-        <w:numPr>
-          <w:ilvl w:val="0"/>
-          <w:numId w:val="2"/>
-        </w:numPr>
-        <w:spacing w:after="100" w:line="300"/>
-      </w:pPr>
-      <w:r>
-        <w:rPr>
-          <w:rFonts w:ascii="Arial" w:cs="Arial" w:eastAsia="Arial" w:hAnsi="Arial"/>
-          <w:color w:val="333333"/>
-          <w:sz w:val="22"/>
-          <w:szCs w:val="22"/>
-        </w:rPr>
-        <w:t xml:space="preserve">Numbered description lines with service type, employee name, and date — matching the current invoice format (e.g. “1) QID Renewal for the following on 21.01.2026” followed by names)</w:t>
-      </w:r>
-    </w:p>
-    <w:p>
-      <w:pPr>
-        <w:pStyle w:val="ListParagraph"/>
-        <w:numPr>
-          <w:ilvl w:val="0"/>
-          <w:numId w:val="2"/>
-        </w:numPr>
-        <w:spacing w:after="100" w:line="300"/>
-      </w:pPr>
-      <w:r>
-        <w:rPr>
-          <w:rFonts w:ascii="Arial" w:cs="Arial" w:eastAsia="Arial" w:hAnsi="Arial"/>
-          <w:color w:val="333333"/>
-          <w:sz w:val="22"/>
-          <w:szCs w:val="22"/>
-        </w:rPr>
-        <w:t xml:space="preserve">Government fees for each line (taken from the receipt data entered by the AM)</w:t>
-      </w:r>
-    </w:p>
-    <w:p>
-      <w:pPr>
-        <w:pStyle w:val="ListParagraph"/>
-        <w:numPr>
-          <w:ilvl w:val="0"/>
-          <w:numId w:val="2"/>
-        </w:numPr>
-        <w:spacing w:after="100" w:line="300"/>
-      </w:pPr>
-      <w:r>
-        <w:rPr>
-          <w:rFonts w:ascii="Arial" w:cs="Arial" w:eastAsia="Arial" w:hAnsi="Arial"/>
-          <w:color w:val="333333"/>
-          <w:sz w:val="22"/>
-          <w:szCs w:val="22"/>
-        </w:rPr>
-        <w:t xml:space="preserve">Professional fees for each line (from the price list, or zero for retainer clients)</w:t>
-      </w:r>
-    </w:p>
-    <w:p>
-      <w:pPr>
-        <w:pStyle w:val="ListParagraph"/>
-        <w:numPr>
-          <w:ilvl w:val="0"/>
-          <w:numId w:val="2"/>
-        </w:numPr>
-        <w:spacing w:after="100" w:line="300"/>
-      </w:pPr>
-      <w:r>
-        <w:rPr>
-          <w:rFonts w:ascii="Arial" w:cs="Arial" w:eastAsia="Arial" w:hAnsi="Arial"/>
-          <w:color w:val="333333"/>
-          <w:sz w:val="22"/>
-          <w:szCs w:val="22"/>
-        </w:rPr>
-        <w:t xml:space="preserve">Line totals and grand total</w:t>
-      </w:r>
-    </w:p>
-    <w:p>
-      <w:pPr>
-        <w:pStyle w:val="ListParagraph"/>
-        <w:numPr>
-          <w:ilvl w:val="0"/>
-          <w:numId w:val="2"/>
-        </w:numPr>
-        <w:spacing w:after="100" w:line="300"/>
-      </w:pPr>
-      <w:r>
-        <w:rPr>
-          <w:rFonts w:ascii="Arial" w:cs="Arial" w:eastAsia="Arial" w:hAnsi="Arial"/>
-          <w:color w:val="333333"/>
-          <w:sz w:val="22"/>
-          <w:szCs w:val="22"/>
-        </w:rPr>
-        <w:t xml:space="preserve">Total amount in words (generated automatically)</w:t>
-      </w:r>
-    </w:p>
-    <w:p>
-      <w:pPr>
-        <w:pStyle w:val="ListParagraph"/>
-        <w:numPr>
-          <w:ilvl w:val="0"/>
-          <w:numId w:val="2"/>
-        </w:numPr>
-        <w:spacing w:after="100" w:line="300"/>
-      </w:pPr>
-      <w:r>
-        <w:rPr>
-          <w:rFonts w:ascii="Arial" w:cs="Arial" w:eastAsia="Arial" w:hAnsi="Arial"/>
-          <w:color w:val="333333"/>
-          <w:sz w:val="22"/>
-          <w:szCs w:val="22"/>
-        </w:rPr>
-        <w:t xml:space="preserve">The correct bank payment details for the right company (Rapid or RCHBS, each with different account numbers and bank addresses)</w:t>
-      </w:r>
-    </w:p>
-    <w:p>
-      <w:pPr>
-        <w:pStyle w:val="ListParagraph"/>
-        <w:numPr>
-          <w:ilvl w:val="0"/>
-          <w:numId w:val="2"/>
-        </w:numPr>
-        <w:spacing w:after="100" w:line="300"/>
-      </w:pPr>
-      <w:r>
-        <w:rPr>
-          <w:rFonts w:ascii="Arial" w:cs="Arial" w:eastAsia="Arial" w:hAnsi="Arial"/>
-          <w:color w:val="333333"/>
-          <w:sz w:val="22"/>
-          <w:szCs w:val="22"/>
-        </w:rPr>
-        <w:t xml:space="preserve">The due date based on the client’s payment terms</w:t>
-      </w:r>
-    </w:p>
-    <w:p>
-      <w:pPr>
-        <w:pStyle w:val="ListParagraph"/>
-        <w:numPr>
-          <w:ilvl w:val="0"/>
-          <w:numId w:val="2"/>
-        </w:numPr>
-        <w:spacing w:after="100" w:line="300"/>
-      </w:pPr>
-      <w:r>
-        <w:rPr>
-          <w:rFonts w:ascii="Arial" w:cs="Arial" w:eastAsia="Arial" w:hAnsi="Arial"/>
-          <w:color w:val="333333"/>
-          <w:sz w:val="22"/>
-          <w:szCs w:val="22"/>
-        </w:rPr>
-        <w:t xml:space="preserve">The next invoice number in sequence (INV/RCH/#### or INV/RCHBS/####)</w:t>
-      </w:r>
-    </w:p>
-    <w:p>
-      <w:pPr>
-        <w:pStyle w:val="ListParagraph"/>
-        <w:numPr>
-          <w:ilvl w:val="0"/>
-          <w:numId w:val="2"/>
-        </w:numPr>
-        <w:spacing w:after="100" w:line="300"/>
-      </w:pPr>
-      <w:r>
-        <w:rPr>
-          <w:rFonts w:ascii="Arial" w:cs="Arial" w:eastAsia="Arial" w:hAnsi="Arial"/>
-          <w:color w:val="333333"/>
-          <w:sz w:val="22"/>
-          <w:szCs w:val="22"/>
-        </w:rPr>
-        <w:t xml:space="preserve">Cost center and business unit columns, if the client requires them</w:t>
-      </w:r>
-    </w:p>
-    <w:p>
-      <w:pPr>
-        <w:pStyle w:val="ListParagraph"/>
-        <w:numPr>
-          <w:ilvl w:val="0"/>
-          <w:numId w:val="2"/>
-        </w:numPr>
-        <w:spacing w:after="100" w:line="300"/>
-      </w:pPr>
-      <w:r>
-        <w:rPr>
-          <w:rFonts w:ascii="Arial" w:cs="Arial" w:eastAsia="Arial" w:hAnsi="Arial"/>
-          <w:color w:val="333333"/>
-          <w:sz w:val="22"/>
-          <w:szCs w:val="22"/>
-        </w:rPr>
-        <w:t xml:space="preserve">Tax PIN and custom addressee lines for clients that need them (e.g. EY’s “Assurance Service Line”)</w:t>
-      </w:r>
-    </w:p>
-    <w:p>
-      <w:pPr>
-        <w:pStyle w:val="ListParagraph"/>
-        <w:numPr>
-          <w:ilvl w:val="0"/>
-          <w:numId w:val="2"/>
-        </w:numPr>
-        <w:spacing w:after="100" w:line="300"/>
-      </w:pPr>
-      <w:r>
-        <w:rPr>
-          <w:rFonts w:ascii="Arial" w:cs="Arial" w:eastAsia="Arial" w:hAnsi="Arial"/>
-          <w:color w:val="333333"/>
-          <w:sz w:val="22"/>
-          <w:szCs w:val="22"/>
-        </w:rPr>
-        <w:t xml:space="preserve">Standard notes (bank transfer charges borne by client, all payments non-refundable)</w:t>
-      </w:r>
-    </w:p>
-    <w:p>
-      <w:pPr>
-        <w:pStyle w:val="Heading3"/>
-      </w:pPr>
-      <w:r>
-        <w:t xml:space="preserve">Review, Approve, and Send</w:t>
-      </w:r>
-    </w:p>
-    <w:p>
-      <w:pPr>
-        <w:spacing w:after="180" w:line="320"/>
-      </w:pPr>
-      <w:r>
-        <w:rPr>
-          <w:rFonts w:ascii="Arial" w:cs="Arial" w:eastAsia="Arial" w:hAnsi="Arial"/>
-          <w:color w:val="333333"/>
-          <w:sz w:val="22"/>
-          <w:szCs w:val="22"/>
-        </w:rPr>
-        <w:t xml:space="preserve">The generated invoice goes into “Draft” status. The Finance Department reviews it on screen. Once confirmed, it is approved and the status changes to ready for sending. The method of delivery (manual email or system-automated) will be decided during implementation. Once the invoice is sent, all the services included on it are marked as “Invoiced” in the CRM, and the invoice data is automatically synced to the accounting software. No manual re-entry is needed.</w:t>
-      </w:r>
-    </w:p>
-    <w:p>
-      <w:pPr>
         <w:pBdr>
           <w:left w:val="single" w:color="2E7D32" w:sz="14" w:space="8"/>
         </w:pBdr>
@@ -2157,6 +1791,525 @@
           <w:sz w:val="22"/>
           <w:szCs w:val="22"/>
         </w:rPr>
+        <w:t xml:space="preserve">Exception:  </w:t>
+      </w:r>
+      <w:r>
+        <w:rPr>
+          <w:rFonts w:ascii="Arial" w:cs="Arial" w:eastAsia="Arial" w:hAnsi="Arial"/>
+          <w:color w:val="333333"/>
+          <w:sz w:val="22"/>
+          <w:szCs w:val="22"/>
+        </w:rPr>
+        <w:t xml:space="preserve">When a Finance Department member or Elena herself completes a service on behalf of an AM, Elena’s approval step is bypassed automatically. The service is marked as approved and moves directly to Gabi’s payment verification. This avoids unnecessary bottlenecks when senior staff are already handling the work.</w:t>
+      </w:r>
+    </w:p>
+    <w:p>
+      <w:pPr>
+        <w:pStyle w:val="Heading2"/>
+      </w:pPr>
+      <w:r>
+        <w:t xml:space="preserve">5.6 Step 6: Gabi Verifies the Payment</w:t>
+      </w:r>
+    </w:p>
+    <w:p>
+      <w:pPr>
+        <w:spacing w:after="180" w:line="320"/>
+      </w:pPr>
+      <w:r>
+        <w:rPr>
+          <w:rFonts w:ascii="Arial" w:cs="Arial" w:eastAsia="Arial" w:hAnsi="Arial"/>
+          <w:color w:val="333333"/>
+          <w:sz w:val="22"/>
+          <w:szCs w:val="22"/>
+        </w:rPr>
+        <w:t xml:space="preserve">After Elena’s approval, the submission goes to Gabi for payment verification. Gabi checks her phone for the SMS bank alerts to confirm that the payment actually happened on the correct card for the correct amount. This step ensures that what was entered into the system matches what actually happened at the bank level.</w:t>
+      </w:r>
+    </w:p>
+    <w:p>
+      <w:pPr>
+        <w:spacing w:after="180" w:line="320"/>
+      </w:pPr>
+      <w:r>
+        <w:rPr>
+          <w:rFonts w:ascii="Arial" w:cs="Arial" w:eastAsia="Arial" w:hAnsi="Arial"/>
+          <w:color w:val="333333"/>
+          <w:sz w:val="22"/>
+          <w:szCs w:val="22"/>
+        </w:rPr>
+        <w:t xml:space="preserve">This is an important change from the current process. Today, Gabi’s verification happens later, during invoice creation, which means problems are caught late and cause delays. In the new system, Gabi’s check happens immediately after the service is completed, so any issues are caught early and do not delay Thursday invoicing.</w:t>
+      </w:r>
+    </w:p>
+    <w:p>
+      <w:pPr>
+        <w:pStyle w:val="Heading2"/>
+      </w:pPr>
+      <w:r>
+        <w:t xml:space="preserve">5.7 Service Status: Verified</w:t>
+      </w:r>
+    </w:p>
+    <w:p>
+      <w:pPr>
+        <w:spacing w:after="180" w:line="320"/>
+      </w:pPr>
+      <w:r>
+        <w:rPr>
+          <w:rFonts w:ascii="Arial" w:cs="Arial" w:eastAsia="Arial" w:hAnsi="Arial"/>
+          <w:color w:val="333333"/>
+          <w:sz w:val="22"/>
+          <w:szCs w:val="22"/>
+        </w:rPr>
+        <w:t xml:space="preserve">Once both Elena and Gabi have approved, the service is marked as “Verified” in the system. At this point:</w:t>
+      </w:r>
+    </w:p>
+    <w:p>
+      <w:pPr>
+        <w:pStyle w:val="ListParagraph"/>
+        <w:numPr>
+          <w:ilvl w:val="0"/>
+          <w:numId w:val="2"/>
+        </w:numPr>
+        <w:spacing w:after="100" w:line="300"/>
+      </w:pPr>
+      <w:r>
+        <w:rPr>
+          <w:rFonts w:ascii="Arial" w:cs="Arial" w:eastAsia="Arial" w:hAnsi="Arial"/>
+          <w:color w:val="333333"/>
+          <w:sz w:val="22"/>
+          <w:szCs w:val="22"/>
+        </w:rPr>
+        <w:t xml:space="preserve">The service appears on the Finance Department’s dashboard as ready to be invoiced</w:t>
+      </w:r>
+    </w:p>
+    <w:p>
+      <w:pPr>
+        <w:pStyle w:val="ListParagraph"/>
+        <w:numPr>
+          <w:ilvl w:val="0"/>
+          <w:numId w:val="2"/>
+        </w:numPr>
+        <w:spacing w:after="100" w:line="300"/>
+      </w:pPr>
+      <w:r>
+        <w:rPr>
+          <w:rFonts w:ascii="Arial" w:cs="Arial" w:eastAsia="Arial" w:hAnsi="Arial"/>
+          <w:color w:val="333333"/>
+          <w:sz w:val="22"/>
+          <w:szCs w:val="22"/>
+        </w:rPr>
+        <w:t xml:space="preserve">The client’s running spending total is updated automatically</w:t>
+      </w:r>
+    </w:p>
+    <w:p>
+      <w:pPr>
+        <w:pStyle w:val="ListParagraph"/>
+        <w:numPr>
+          <w:ilvl w:val="0"/>
+          <w:numId w:val="2"/>
+        </w:numPr>
+        <w:spacing w:after="100" w:line="300"/>
+      </w:pPr>
+      <w:r>
+        <w:rPr>
+          <w:rFonts w:ascii="Arial" w:cs="Arial" w:eastAsia="Arial" w:hAnsi="Arial"/>
+          <w:color w:val="333333"/>
+          <w:sz w:val="22"/>
+          <w:szCs w:val="22"/>
+        </w:rPr>
+        <w:t xml:space="preserve">The system checks the client’s spending limit and shows a warning if they are near or over</w:t>
+      </w:r>
+    </w:p>
+    <w:p>
+      <w:pPr>
+        <w:pStyle w:val="ListParagraph"/>
+        <w:numPr>
+          <w:ilvl w:val="0"/>
+          <w:numId w:val="2"/>
+        </w:numPr>
+        <w:spacing w:after="100" w:line="300"/>
+      </w:pPr>
+      <w:r>
+        <w:rPr>
+          <w:rFonts w:ascii="Arial" w:cs="Arial" w:eastAsia="Arial" w:hAnsi="Arial"/>
+          <w:color w:val="333333"/>
+          <w:sz w:val="22"/>
+          <w:szCs w:val="22"/>
+        </w:rPr>
+        <w:t xml:space="preserve">The transaction is visible on the real-time dashboard for all roles</w:t>
+      </w:r>
+    </w:p>
+    <w:p>
+      <w:pPr>
+        <w:pStyle w:val="Heading1"/>
+      </w:pPr>
+      <w:r>
+        <w:t xml:space="preserve">7. Invoicing</w:t>
+      </w:r>
+    </w:p>
+    <w:p>
+      <w:pPr>
+        <w:spacing w:after="180" w:line="320"/>
+      </w:pPr>
+      <w:r>
+        <w:rPr>
+          <w:rFonts w:ascii="Arial" w:cs="Arial" w:eastAsia="Arial" w:hAnsi="Arial"/>
+          <w:color w:val="333333"/>
+          <w:sz w:val="22"/>
+          <w:szCs w:val="22"/>
+        </w:rPr>
+        <w:t xml:space="preserve">Invoicing is the most important process for the Finance Department. The new system changes it from a manual, paper-based task into a fast, mostly automated process with just two steps: choose the client, and choose the services. There are three types of invoices.</w:t>
+      </w:r>
+    </w:p>
+    <w:p>
+      <w:pPr>
+        <w:pStyle w:val="Heading2"/>
+      </w:pPr>
+      <w:r>
+        <w:t xml:space="preserve">6.1 Weekly Service Invoices (Every Thursday)</w:t>
+      </w:r>
+    </w:p>
+    <w:p>
+      <w:pPr>
+        <w:pStyle w:val="Heading3"/>
+      </w:pPr>
+      <w:r>
+        <w:t xml:space="preserve">Invoice Triggers</w:t>
+      </w:r>
+    </w:p>
+    <w:p>
+      <w:pPr>
+        <w:spacing w:after="180" w:line="320"/>
+      </w:pPr>
+      <w:r>
+        <w:rPr>
+          <w:rFonts w:ascii="Arial" w:cs="Arial" w:eastAsia="Arial" w:hAnsi="Arial"/>
+          <w:color w:val="333333"/>
+          <w:sz w:val="22"/>
+          <w:szCs w:val="22"/>
+        </w:rPr>
+        <w:t xml:space="preserve">Thursday is the standard invoicing day. However, the system also triggers invoicing in two other cases: when a client hits their spending limit (Finance should invoice immediately rather than wait), and when a verified service has been sitting uninvoiced for more than approximately 20 days (the system shows a persistent alert until it is dealt with).</w:t>
+      </w:r>
+    </w:p>
+    <w:p>
+      <w:pPr>
+        <w:pStyle w:val="Heading3"/>
+      </w:pPr>
+      <w:r>
+        <w:t xml:space="preserve">What Finance Sees on Thursday</w:t>
+      </w:r>
+    </w:p>
+    <w:p>
+      <w:pPr>
+        <w:spacing w:after="180" w:line="320"/>
+      </w:pPr>
+      <w:r>
+        <w:rPr>
+          <w:rFonts w:ascii="Arial" w:cs="Arial" w:eastAsia="Arial" w:hAnsi="Arial"/>
+          <w:color w:val="333333"/>
+          <w:sz w:val="22"/>
+          <w:szCs w:val="22"/>
+        </w:rPr>
+        <w:t xml:space="preserve">The Finance Department opens the CRM and sees a dashboard of all verified services that have not yet been invoiced. The dashboard is sorted so that clients with the highest total government fees appear at the top — this helps Finance prioritize the most important invoices first. Services are grouped by client, showing the total amount of uninvoiced government fees per client.</w:t>
+      </w:r>
+    </w:p>
+    <w:p>
+      <w:pPr>
+        <w:pStyle w:val="Heading3"/>
+      </w:pPr>
+      <w:r>
+        <w:t xml:space="preserve">Creating an Invoice: Two Steps</w:t>
+      </w:r>
+    </w:p>
+    <w:p>
+      <w:pPr>
+        <w:spacing w:after="180" w:line="320"/>
+      </w:pPr>
+      <w:r>
+        <w:rPr>
+          <w:rFonts w:ascii="Arial" w:cs="Arial" w:eastAsia="Arial" w:hAnsi="Arial"/>
+          <w:color w:val="333333"/>
+          <w:sz w:val="22"/>
+          <w:szCs w:val="22"/>
+        </w:rPr>
+        <w:t xml:space="preserve">The Finance Department selects a client from the dashboard. The system shows all uninvoiced services for that client. Finance picks which services to include (they can select all of them or just some). The system then generates a draft invoice automatically. It fills in everything:</w:t>
+      </w:r>
+    </w:p>
+    <w:p>
+      <w:pPr>
+        <w:pStyle w:val="ListParagraph"/>
+        <w:numPr>
+          <w:ilvl w:val="0"/>
+          <w:numId w:val="2"/>
+        </w:numPr>
+        <w:spacing w:after="100" w:line="300"/>
+      </w:pPr>
+      <w:r>
+        <w:rPr>
+          <w:rFonts w:ascii="Arial" w:cs="Arial" w:eastAsia="Arial" w:hAnsi="Arial"/>
+          <w:color w:val="333333"/>
+          <w:sz w:val="22"/>
+          <w:szCs w:val="22"/>
+        </w:rPr>
+        <w:t xml:space="preserve">Numbered description lines with service type, employee name, and date — matching the current invoice format (e.g. “1) QID Renewal for the following on 21.01.2026” followed by names)</w:t>
+      </w:r>
+    </w:p>
+    <w:p>
+      <w:pPr>
+        <w:pStyle w:val="ListParagraph"/>
+        <w:numPr>
+          <w:ilvl w:val="0"/>
+          <w:numId w:val="2"/>
+        </w:numPr>
+        <w:spacing w:after="100" w:line="300"/>
+      </w:pPr>
+      <w:r>
+        <w:rPr>
+          <w:rFonts w:ascii="Arial" w:cs="Arial" w:eastAsia="Arial" w:hAnsi="Arial"/>
+          <w:color w:val="333333"/>
+          <w:sz w:val="22"/>
+          <w:szCs w:val="22"/>
+        </w:rPr>
+        <w:t xml:space="preserve">Government fees for each line (taken from the receipt data entered by the AM)</w:t>
+      </w:r>
+    </w:p>
+    <w:p>
+      <w:pPr>
+        <w:pStyle w:val="ListParagraph"/>
+        <w:numPr>
+          <w:ilvl w:val="0"/>
+          <w:numId w:val="2"/>
+        </w:numPr>
+        <w:spacing w:after="100" w:line="300"/>
+      </w:pPr>
+      <w:r>
+        <w:rPr>
+          <w:rFonts w:ascii="Arial" w:cs="Arial" w:eastAsia="Arial" w:hAnsi="Arial"/>
+          <w:color w:val="333333"/>
+          <w:sz w:val="22"/>
+          <w:szCs w:val="22"/>
+        </w:rPr>
+        <w:t xml:space="preserve">Professional fees for each line (from the price list, or zero for retainer clients)</w:t>
+      </w:r>
+    </w:p>
+    <w:p>
+      <w:pPr>
+        <w:pStyle w:val="ListParagraph"/>
+        <w:numPr>
+          <w:ilvl w:val="0"/>
+          <w:numId w:val="2"/>
+        </w:numPr>
+        <w:spacing w:after="100" w:line="300"/>
+      </w:pPr>
+      <w:r>
+        <w:rPr>
+          <w:rFonts w:ascii="Arial" w:cs="Arial" w:eastAsia="Arial" w:hAnsi="Arial"/>
+          <w:color w:val="333333"/>
+          <w:sz w:val="22"/>
+          <w:szCs w:val="22"/>
+        </w:rPr>
+        <w:t xml:space="preserve">Line totals and grand total</w:t>
+      </w:r>
+    </w:p>
+    <w:p>
+      <w:pPr>
+        <w:pStyle w:val="ListParagraph"/>
+        <w:numPr>
+          <w:ilvl w:val="0"/>
+          <w:numId w:val="2"/>
+        </w:numPr>
+        <w:spacing w:after="100" w:line="300"/>
+      </w:pPr>
+      <w:r>
+        <w:rPr>
+          <w:rFonts w:ascii="Arial" w:cs="Arial" w:eastAsia="Arial" w:hAnsi="Arial"/>
+          <w:color w:val="333333"/>
+          <w:sz w:val="22"/>
+          <w:szCs w:val="22"/>
+        </w:rPr>
+        <w:t xml:space="preserve">Total amount in words (generated automatically)</w:t>
+      </w:r>
+    </w:p>
+    <w:p>
+      <w:pPr>
+        <w:pStyle w:val="ListParagraph"/>
+        <w:numPr>
+          <w:ilvl w:val="0"/>
+          <w:numId w:val="2"/>
+        </w:numPr>
+        <w:spacing w:after="100" w:line="300"/>
+      </w:pPr>
+      <w:r>
+        <w:rPr>
+          <w:rFonts w:ascii="Arial" w:cs="Arial" w:eastAsia="Arial" w:hAnsi="Arial"/>
+          <w:color w:val="333333"/>
+          <w:sz w:val="22"/>
+          <w:szCs w:val="22"/>
+        </w:rPr>
+        <w:t xml:space="preserve">The correct bank payment details for the right company (Rapid or RCHBS, each with different account numbers and bank addresses)</w:t>
+      </w:r>
+    </w:p>
+    <w:p>
+      <w:pPr>
+        <w:pStyle w:val="ListParagraph"/>
+        <w:numPr>
+          <w:ilvl w:val="0"/>
+          <w:numId w:val="2"/>
+        </w:numPr>
+        <w:spacing w:after="100" w:line="300"/>
+      </w:pPr>
+      <w:r>
+        <w:rPr>
+          <w:rFonts w:ascii="Arial" w:cs="Arial" w:eastAsia="Arial" w:hAnsi="Arial"/>
+          <w:color w:val="333333"/>
+          <w:sz w:val="22"/>
+          <w:szCs w:val="22"/>
+        </w:rPr>
+        <w:t xml:space="preserve">The due date based on the client’s payment terms</w:t>
+      </w:r>
+    </w:p>
+    <w:p>
+      <w:pPr>
+        <w:pStyle w:val="ListParagraph"/>
+        <w:numPr>
+          <w:ilvl w:val="0"/>
+          <w:numId w:val="2"/>
+        </w:numPr>
+        <w:spacing w:after="100" w:line="300"/>
+      </w:pPr>
+      <w:r>
+        <w:rPr>
+          <w:rFonts w:ascii="Arial" w:cs="Arial" w:eastAsia="Arial" w:hAnsi="Arial"/>
+          <w:color w:val="333333"/>
+          <w:sz w:val="22"/>
+          <w:szCs w:val="22"/>
+        </w:rPr>
+        <w:t xml:space="preserve">The next invoice number in sequence (INV/RCH/#### or INV/RCHBS/####)</w:t>
+      </w:r>
+    </w:p>
+    <w:p>
+      <w:pPr>
+        <w:pStyle w:val="ListParagraph"/>
+        <w:numPr>
+          <w:ilvl w:val="0"/>
+          <w:numId w:val="2"/>
+        </w:numPr>
+        <w:spacing w:after="100" w:line="300"/>
+      </w:pPr>
+      <w:r>
+        <w:rPr>
+          <w:rFonts w:ascii="Arial" w:cs="Arial" w:eastAsia="Arial" w:hAnsi="Arial"/>
+          <w:color w:val="333333"/>
+          <w:sz w:val="22"/>
+          <w:szCs w:val="22"/>
+        </w:rPr>
+        <w:t xml:space="preserve">Cost center and business unit columns, if the client requires them</w:t>
+      </w:r>
+    </w:p>
+    <w:p>
+      <w:pPr>
+        <w:pStyle w:val="ListParagraph"/>
+        <w:numPr>
+          <w:ilvl w:val="0"/>
+          <w:numId w:val="2"/>
+        </w:numPr>
+        <w:spacing w:after="100" w:line="300"/>
+      </w:pPr>
+      <w:r>
+        <w:rPr>
+          <w:rFonts w:ascii="Arial" w:cs="Arial" w:eastAsia="Arial" w:hAnsi="Arial"/>
+          <w:color w:val="333333"/>
+          <w:sz w:val="22"/>
+          <w:szCs w:val="22"/>
+        </w:rPr>
+        <w:t xml:space="preserve">Tax PIN and custom addressee lines for clients that need them (e.g. EY’s “Assurance Service Line”)</w:t>
+      </w:r>
+    </w:p>
+    <w:p>
+      <w:pPr>
+        <w:pStyle w:val="ListParagraph"/>
+        <w:numPr>
+          <w:ilvl w:val="0"/>
+          <w:numId w:val="2"/>
+        </w:numPr>
+        <w:spacing w:after="100" w:line="300"/>
+      </w:pPr>
+      <w:r>
+        <w:rPr>
+          <w:rFonts w:ascii="Arial" w:cs="Arial" w:eastAsia="Arial" w:hAnsi="Arial"/>
+          <w:color w:val="333333"/>
+          <w:sz w:val="22"/>
+          <w:szCs w:val="22"/>
+        </w:rPr>
+        <w:t xml:space="preserve">Standard notes (bank transfer charges borne by client, all payments non-refundable)</w:t>
+      </w:r>
+    </w:p>
+    <w:p>
+      <w:pPr>
+        <w:pStyle w:val="Heading3"/>
+      </w:pPr>
+      <w:r>
+        <w:t xml:space="preserve">Review, Approve, and Send</w:t>
+      </w:r>
+    </w:p>
+    <w:p>
+      <w:pPr>
+        <w:spacing w:after="180" w:line="320"/>
+      </w:pPr>
+      <w:r>
+        <w:rPr>
+          <w:rFonts w:ascii="Arial" w:cs="Arial" w:eastAsia="Arial" w:hAnsi="Arial"/>
+          <w:color w:val="333333"/>
+          <w:sz w:val="22"/>
+          <w:szCs w:val="22"/>
+        </w:rPr>
+        <w:t xml:space="preserve">The generated invoice goes through an approval workflow that depends on who created it. If an accountant generates the invoice, it enters “Pending Approval” status and appears in the Accounting Manager’s approval queue. The Accounting Manager reviews the invoice and either approves or rejects it. If the Accounting Manager herself generates the invoice, it is automatically approved and skips the approval queue.</w:t>
+      </w:r>
+    </w:p>
+    <w:p>
+      <w:pPr>
+        <w:spacing w:after="180" w:line="320"/>
+      </w:pPr>
+      <w:r>
+        <w:rPr>
+          <w:rFonts w:ascii="Arial" w:cs="Arial" w:eastAsia="Arial" w:hAnsi="Arial"/>
+          <w:color w:val="333333"/>
+          <w:sz w:val="22"/>
+          <w:szCs w:val="22"/>
+        </w:rPr>
+        <w:t xml:space="preserve">When an invoice is rejected, the Accounting Manager provides a reason. The rejection reverts all linked service logs back to “Expensed” status so they can be re-selected for a corrected invoice. Rejected invoices are kept in the system for audit trail purposes and displayed in a collapsible section for reference.</w:t>
+      </w:r>
+    </w:p>
+    <w:p>
+      <w:pPr>
+        <w:spacing w:after="180" w:line="320"/>
+      </w:pPr>
+      <w:r>
+        <w:rPr>
+          <w:rFonts w:ascii="Arial" w:cs="Arial" w:eastAsia="Arial" w:hAnsi="Arial"/>
+          <w:color w:val="333333"/>
+          <w:sz w:val="22"/>
+          <w:szCs w:val="22"/>
+        </w:rPr>
+        <w:t xml:space="preserve">Once approved, the invoice status changes to ready for sending. The method of delivery (manual email or system-automated) will be decided during implementation. Once the invoice is sent, all the services included on it are marked as “Invoiced” in the CRM, and the invoice data is automatically synced to the accounting software. No manual re-entry is needed.</w:t>
+      </w:r>
+    </w:p>
+    <w:p>
+      <w:pPr>
+        <w:pBdr>
+          <w:left w:val="single" w:color="2E7D32" w:sz="14" w:space="8"/>
+        </w:pBdr>
+        <w:shd w:fill="E8F5E9" w:val="clear"/>
+        <w:spacing w:after="220" w:before="140"/>
+        <w:ind w:left="200" w:right="200"/>
+      </w:pPr>
+      <w:r>
+        <w:rPr>
+          <w:rFonts w:ascii="Arial" w:cs="Arial" w:eastAsia="Arial" w:hAnsi="Arial"/>
+          <w:b/>
+          <w:bCs/>
+          <w:color w:val="2E7D32"/>
+          <w:sz w:val="22"/>
+          <w:szCs w:val="22"/>
+        </w:rPr>
         <w:t xml:space="preserve">What disappears:  </w:t>
       </w:r>
       <w:r>
@@ -2318,21 +2471,35 @@
         <w:pStyle w:val="Heading2"/>
       </w:pPr>
       <w:r>
-        <w:t xml:space="preserve">9.1 Current Card Setup</w:t>
-      </w:r>
-    </w:p>
-    <w:p>
-      <w:pPr>
-        <w:spacing w:after="180" w:line="320"/>
-      </w:pPr>
-      <w:r>
-        <w:rPr>
-          <w:rFonts w:ascii="Arial" w:cs="Arial" w:eastAsia="Arial" w:hAnsi="Arial"/>
-          <w:color w:val="333333"/>
-          <w:sz w:val="22"/>
-          <w:szCs w:val="22"/>
-        </w:rPr>
-        <w:t xml:space="preserve">Rapid currently uses 3 credit cards. RCHBS uses 1 credit card and 3 Himyan prepaid cards. All cards are from QNB and are held by the Operations team. The number and type of cards may change in the future, so the system must allow admin users to add, remove, or update cards at any time.</w:t>
+        <w:t xml:space="preserve">9.1 Card Setup and Management</w:t>
+      </w:r>
+    </w:p>
+    <w:p>
+      <w:pPr>
+        <w:spacing w:after="180" w:line="320"/>
+      </w:pPr>
+      <w:r>
+        <w:rPr>
+          <w:rFonts w:ascii="Arial" w:cs="Arial" w:eastAsia="Arial" w:hAnsi="Arial"/>
+          <w:color w:val="333333"/>
+          <w:sz w:val="22"/>
+          <w:szCs w:val="22"/>
+        </w:rPr>
+        <w:t xml:space="preserve">Rapid currently uses 3 credit cards. RCHBS uses 1 credit card and 3 Himyan prepaid cards. All cards are from QNB and are held by the Operations team. The system supports full dynamic card management: authorized users can add new cards, edit card details (label, credit limit), and deactivate cards that are no longer in use. Deactivated cards are hidden from service logging forms but their historical transactions are preserved.</w:t>
+      </w:r>
+    </w:p>
+    <w:p>
+      <w:pPr>
+        <w:spacing w:after="180" w:line="320"/>
+      </w:pPr>
+      <w:r>
+        <w:rPr>
+          <w:rFonts w:ascii="Arial" w:cs="Arial" w:eastAsia="Arial" w:hAnsi="Arial"/>
+          <w:color w:val="333333"/>
+          <w:sz w:val="22"/>
+          <w:szCs w:val="22"/>
+        </w:rPr>
+        <w:t xml:space="preserve">Each card has a dedicated detail panel accessible through a tabbed interface. The detail panel shows the card’s properties (company, type, limit) and a full transaction ledger. The ledger merges all debits (government fees paid via the card, linked from service logs) and credits (top-ups) into a single chronological view with a running balance. For credit cards, the opening balance appears as the initial credit limit entry.</w:t>
       </w:r>
     </w:p>
     <w:p>
@@ -3382,26 +3549,45 @@
           <w:sz w:val="22"/>
           <w:szCs w:val="22"/>
         </w:rPr>
-        <w:t xml:space="preserve">Card spending per card, per day, per company</w:t>
-      </w:r>
-    </w:p>
-    <w:p>
-      <w:pPr>
-        <w:pStyle w:val="ListParagraph"/>
-        <w:numPr>
-          <w:ilvl w:val="0"/>
-          <w:numId w:val="2"/>
-        </w:numPr>
-        <w:spacing w:after="100" w:line="300"/>
-      </w:pPr>
-      <w:r>
-        <w:rPr>
-          <w:rFonts w:ascii="Arial" w:cs="Arial" w:eastAsia="Arial" w:hAnsi="Arial"/>
-          <w:color w:val="333333"/>
-          <w:sz w:val="22"/>
-          <w:szCs w:val="22"/>
-        </w:rPr>
-        <w:t xml:space="preserve">Card balance indicators (low balance warnings for top-ups)</w:t>
+        <w:t xml:space="preserve">Card Health summary — a compact overview of all active cards with color-coded dot indicators (green = healthy, orange = getting low, red = near limit) for at-a-glance status</w:t>
+      </w:r>
+    </w:p>
+    <w:p>
+      <w:pPr>
+        <w:pStyle w:val="ListParagraph"/>
+        <w:numPr>
+          <w:ilvl w:val="0"/>
+          <w:numId w:val="2"/>
+        </w:numPr>
+        <w:spacing w:after="100" w:line="300"/>
+      </w:pPr>
+      <w:r>
+        <w:rPr>
+          <w:rFonts w:ascii="Arial" w:cs="Arial" w:eastAsia="Arial" w:hAnsi="Arial"/>
+          <w:color w:val="333333"/>
+          <w:sz w:val="22"/>
+          <w:szCs w:val="22"/>
+        </w:rPr>
+        <w:t xml:space="preserve">Click-through to Card Management tab for detailed per-card transaction ledgers</w:t>
+      </w:r>
+    </w:p>
+    <w:p>
+      <w:pPr>
+        <w:pStyle w:val="ListParagraph"/>
+        <w:numPr>
+          <w:ilvl w:val="0"/>
+          <w:numId w:val="2"/>
+        </w:numPr>
+        <w:spacing w:after="100" w:line="300"/>
+      </w:pPr>
+      <w:r>
+        <w:rPr>
+          <w:rFonts w:ascii="Arial" w:cs="Arial" w:eastAsia="Arial" w:hAnsi="Arial"/>
+          <w:color w:val="333333"/>
+          <w:sz w:val="22"/>
+          <w:szCs w:val="22"/>
+        </w:rPr>
+        <w:t xml:space="preserve">Card top-up recording directly from the expense tracker</w:t>
       </w:r>
     </w:p>
     <w:p>
@@ -3444,25 +3630,6 @@
     </w:p>
     <w:p>
       <w:pPr>
-        <w:pStyle w:val="ListParagraph"/>
-        <w:numPr>
-          <w:ilvl w:val="0"/>
-          <w:numId w:val="2"/>
-        </w:numPr>
-        <w:spacing w:after="100" w:line="300"/>
-      </w:pPr>
-      <w:r>
-        <w:rPr>
-          <w:rFonts w:ascii="Arial" w:cs="Arial" w:eastAsia="Arial" w:hAnsi="Arial"/>
-          <w:color w:val="333333"/>
-          <w:sz w:val="22"/>
-          <w:szCs w:val="22"/>
-        </w:rPr>
-        <w:t xml:space="preserve">Transaction history with uploaded receipts</w:t>
-      </w:r>
-    </w:p>
-    <w:p>
-      <w:pPr>
         <w:pStyle w:val="Heading2"/>
       </w:pPr>
       <w:r>
@@ -3598,11 +3765,384 @@
       </w:r>
     </w:p>
     <w:p>
+      <w:r>
+        <w:br w:type="page"/>
+      </w:r>
+    </w:p>
+    <w:p>
       <w:pPr>
         <w:pStyle w:val="Heading1"/>
       </w:pPr>
       <w:r>
-        <w:t xml:space="preserve">16. Glossary</w:t>
+        <w:t xml:space="preserve">16. Permissions and Role Management</w:t>
+      </w:r>
+    </w:p>
+    <w:p>
+      <w:pPr>
+        <w:spacing w:after="180" w:line="320"/>
+      </w:pPr>
+      <w:r>
+        <w:rPr>
+          <w:rFonts w:ascii="Arial" w:cs="Arial" w:eastAsia="Arial" w:hAnsi="Arial"/>
+          <w:color w:val="333333"/>
+          <w:sz w:val="22"/>
+          <w:szCs w:val="22"/>
+        </w:rPr>
+        <w:t xml:space="preserve">The system uses a tag-based permission model to control what each user can see and do. Rather than hard-coding permissions into each role, the system defines a set of permission tags that can be flexibly assigned to roles and individual users.</w:t>
+      </w:r>
+    </w:p>
+    <w:p>
+      <w:pPr>
+        <w:pStyle w:val="Heading2"/>
+      </w:pPr>
+      <w:r>
+        <w:t xml:space="preserve">16.1 Permission Tags</w:t>
+      </w:r>
+    </w:p>
+    <w:p>
+      <w:pPr>
+        <w:spacing w:after="180" w:line="320"/>
+      </w:pPr>
+      <w:r>
+        <w:rPr>
+          <w:rFonts w:ascii="Arial" w:cs="Arial" w:eastAsia="Arial" w:hAnsi="Arial"/>
+          <w:color w:val="333333"/>
+          <w:sz w:val="22"/>
+          <w:szCs w:val="22"/>
+        </w:rPr>
+        <w:t xml:space="preserve">Permission tags are organized into three categories:</w:t>
+      </w:r>
+    </w:p>
+    <w:p>
+      <w:pPr>
+        <w:pStyle w:val="ListParagraph"/>
+        <w:numPr>
+          <w:ilvl w:val="0"/>
+          <w:numId w:val="2"/>
+        </w:numPr>
+        <w:spacing w:after="100" w:line="300"/>
+      </w:pPr>
+      <w:r>
+        <w:rPr>
+          <w:rFonts w:ascii="Arial" w:cs="Arial" w:eastAsia="Arial" w:hAnsi="Arial"/>
+          <w:color w:val="333333"/>
+          <w:sz w:val="22"/>
+          <w:szCs w:val="22"/>
+        </w:rPr>
+        <w:t xml:space="preserve">Navigation tags — control which screens a user can access (e.g. Dashboard, Clients, Finance/Invoicing, Expense Tracker, CFO Dashboard, Role Management)</w:t>
+      </w:r>
+    </w:p>
+    <w:p>
+      <w:pPr>
+        <w:pStyle w:val="ListParagraph"/>
+        <w:numPr>
+          <w:ilvl w:val="0"/>
+          <w:numId w:val="2"/>
+        </w:numPr>
+        <w:spacing w:after="100" w:line="300"/>
+      </w:pPr>
+      <w:r>
+        <w:rPr>
+          <w:rFonts w:ascii="Arial" w:cs="Arial" w:eastAsia="Arial" w:hAnsi="Arial"/>
+          <w:color w:val="333333"/>
+          <w:sz w:val="22"/>
+          <w:szCs w:val="22"/>
+        </w:rPr>
+        <w:t xml:space="preserve">Action tags — control what operations a user can perform (e.g. Approve/Reject Submissions, Create Invoices, Verify Expenses, Onboard Clients, Manage Roles)</w:t>
+      </w:r>
+    </w:p>
+    <w:p>
+      <w:pPr>
+        <w:pStyle w:val="ListParagraph"/>
+        <w:numPr>
+          <w:ilvl w:val="0"/>
+          <w:numId w:val="2"/>
+        </w:numPr>
+        <w:spacing w:after="100" w:line="300"/>
+      </w:pPr>
+      <w:r>
+        <w:rPr>
+          <w:rFonts w:ascii="Arial" w:cs="Arial" w:eastAsia="Arial" w:hAnsi="Arial"/>
+          <w:color w:val="333333"/>
+          <w:sz w:val="22"/>
+          <w:szCs w:val="22"/>
+        </w:rPr>
+        <w:t xml:space="preserve">Data Scope tags — control how much data a user can see (e.g. See Own Clients Only vs. See All Clients, See Own Logs Only vs. See All Logs)</w:t>
+      </w:r>
+    </w:p>
+    <w:p>
+      <w:pPr>
+        <w:spacing w:after="180" w:line="320"/>
+      </w:pPr>
+      <w:r>
+        <w:rPr>
+          <w:rFonts w:ascii="Arial" w:cs="Arial" w:eastAsia="Arial" w:hAnsi="Arial"/>
+          <w:color w:val="333333"/>
+          <w:sz w:val="22"/>
+          <w:szCs w:val="22"/>
+        </w:rPr>
+        <w:t xml:space="preserve">The system currently defines 23 permission tags across these three categories. New tags can be added as the system evolves.</w:t>
+      </w:r>
+    </w:p>
+    <w:p>
+      <w:pPr>
+        <w:pStyle w:val="Heading2"/>
+      </w:pPr>
+      <w:r>
+        <w:t xml:space="preserve">16.2 Default Roles</w:t>
+      </w:r>
+    </w:p>
+    <w:p>
+      <w:pPr>
+        <w:spacing w:after="180" w:line="320"/>
+      </w:pPr>
+      <w:r>
+        <w:rPr>
+          <w:rFonts w:ascii="Arial" w:cs="Arial" w:eastAsia="Arial" w:hAnsi="Arial"/>
+          <w:color w:val="333333"/>
+          <w:sz w:val="22"/>
+          <w:szCs w:val="22"/>
+        </w:rPr>
+        <w:t xml:space="preserve">Each role in the system has a default set of permission tags. The default roles are:</w:t>
+      </w:r>
+    </w:p>
+    <w:p>
+      <w:pPr>
+        <w:pStyle w:val="ListParagraph"/>
+        <w:numPr>
+          <w:ilvl w:val="0"/>
+          <w:numId w:val="2"/>
+        </w:numPr>
+        <w:spacing w:after="100" w:line="300"/>
+      </w:pPr>
+      <w:r>
+        <w:rPr>
+          <w:rFonts w:ascii="Arial" w:cs="Arial" w:eastAsia="Arial" w:hAnsi="Arial"/>
+          <w:color w:val="333333"/>
+          <w:sz w:val="22"/>
+          <w:szCs w:val="22"/>
+        </w:rPr>
+        <w:t xml:space="preserve">Account Manager — can access their own clients and logs, log new services, onboard clients, and view submissions</w:t>
+      </w:r>
+    </w:p>
+    <w:p>
+      <w:pPr>
+        <w:pStyle w:val="ListParagraph"/>
+        <w:numPr>
+          <w:ilvl w:val="0"/>
+          <w:numId w:val="2"/>
+        </w:numPr>
+        <w:spacing w:after="100" w:line="300"/>
+      </w:pPr>
+      <w:r>
+        <w:rPr>
+          <w:rFonts w:ascii="Arial" w:cs="Arial" w:eastAsia="Arial" w:hAnsi="Arial"/>
+          <w:color w:val="333333"/>
+          <w:sz w:val="22"/>
+          <w:szCs w:val="22"/>
+        </w:rPr>
+        <w:t xml:space="preserve">Team Leader (Elena) — can see all clients and logs, approve submissions, manage the service catalog and price lists, and reassign clients between AMs</w:t>
+      </w:r>
+    </w:p>
+    <w:p>
+      <w:pPr>
+        <w:pStyle w:val="ListParagraph"/>
+        <w:numPr>
+          <w:ilvl w:val="0"/>
+          <w:numId w:val="2"/>
+        </w:numPr>
+        <w:spacing w:after="100" w:line="300"/>
+      </w:pPr>
+      <w:r>
+        <w:rPr>
+          <w:rFonts w:ascii="Arial" w:cs="Arial" w:eastAsia="Arial" w:hAnsi="Arial"/>
+          <w:color w:val="333333"/>
+          <w:sz w:val="22"/>
+          <w:szCs w:val="22"/>
+        </w:rPr>
+        <w:t xml:space="preserve">Expense Tracker (Gabi) — can access the expense tracker and verify expenses</w:t>
+      </w:r>
+    </w:p>
+    <w:p>
+      <w:pPr>
+        <w:pStyle w:val="ListParagraph"/>
+        <w:numPr>
+          <w:ilvl w:val="0"/>
+          <w:numId w:val="2"/>
+        </w:numPr>
+        <w:spacing w:after="100" w:line="300"/>
+      </w:pPr>
+      <w:r>
+        <w:rPr>
+          <w:rFonts w:ascii="Arial" w:cs="Arial" w:eastAsia="Arial" w:hAnsi="Arial"/>
+          <w:color w:val="333333"/>
+          <w:sz w:val="22"/>
+          <w:szCs w:val="22"/>
+        </w:rPr>
+        <w:t xml:space="preserve">Accountant — can access finance/invoicing, create invoices, and see all data</w:t>
+      </w:r>
+    </w:p>
+    <w:p>
+      <w:pPr>
+        <w:pStyle w:val="ListParagraph"/>
+        <w:numPr>
+          <w:ilvl w:val="0"/>
+          <w:numId w:val="2"/>
+        </w:numPr>
+        <w:spacing w:after="100" w:line="300"/>
+      </w:pPr>
+      <w:r>
+        <w:rPr>
+          <w:rFonts w:ascii="Arial" w:cs="Arial" w:eastAsia="Arial" w:hAnsi="Arial"/>
+          <w:color w:val="333333"/>
+          <w:sz w:val="22"/>
+          <w:szCs w:val="22"/>
+        </w:rPr>
+        <w:t xml:space="preserve">Accounting Manager — same as accountant, plus can approve or reject invoices created by accountants</w:t>
+      </w:r>
+    </w:p>
+    <w:p>
+      <w:pPr>
+        <w:pStyle w:val="ListParagraph"/>
+        <w:numPr>
+          <w:ilvl w:val="0"/>
+          <w:numId w:val="2"/>
+        </w:numPr>
+        <w:spacing w:after="100" w:line="300"/>
+      </w:pPr>
+      <w:r>
+        <w:rPr>
+          <w:rFonts w:ascii="Arial" w:cs="Arial" w:eastAsia="Arial" w:hAnsi="Arial"/>
+          <w:color w:val="333333"/>
+          <w:sz w:val="22"/>
+          <w:szCs w:val="22"/>
+        </w:rPr>
+        <w:t xml:space="preserve">CFO — can access the management dashboard and view all client data</w:t>
+      </w:r>
+    </w:p>
+    <w:p>
+      <w:pPr>
+        <w:pStyle w:val="ListParagraph"/>
+        <w:numPr>
+          <w:ilvl w:val="0"/>
+          <w:numId w:val="2"/>
+        </w:numPr>
+        <w:spacing w:after="100" w:line="300"/>
+      </w:pPr>
+      <w:r>
+        <w:rPr>
+          <w:rFonts w:ascii="Arial" w:cs="Arial" w:eastAsia="Arial" w:hAnsi="Arial"/>
+          <w:color w:val="333333"/>
+          <w:sz w:val="22"/>
+          <w:szCs w:val="22"/>
+        </w:rPr>
+        <w:t xml:space="preserve">Super Admin — has all permission tags; used for system administration</w:t>
+      </w:r>
+    </w:p>
+    <w:p>
+      <w:pPr>
+        <w:pStyle w:val="Heading2"/>
+      </w:pPr>
+      <w:r>
+        <w:t xml:space="preserve">16.3 Role Management UI</w:t>
+      </w:r>
+    </w:p>
+    <w:p>
+      <w:pPr>
+        <w:spacing w:after="180" w:line="320"/>
+      </w:pPr>
+      <w:r>
+        <w:rPr>
+          <w:rFonts w:ascii="Arial" w:cs="Arial" w:eastAsia="Arial" w:hAnsi="Arial"/>
+          <w:color w:val="333333"/>
+          <w:sz w:val="22"/>
+          <w:szCs w:val="22"/>
+        </w:rPr>
+        <w:t xml:space="preserve">Authorized administrators can manage roles through a dedicated Role Management screen. From this screen they can:</w:t>
+      </w:r>
+    </w:p>
+    <w:p>
+      <w:pPr>
+        <w:pStyle w:val="ListParagraph"/>
+        <w:numPr>
+          <w:ilvl w:val="0"/>
+          <w:numId w:val="2"/>
+        </w:numPr>
+        <w:spacing w:after="100" w:line="300"/>
+      </w:pPr>
+      <w:r>
+        <w:rPr>
+          <w:rFonts w:ascii="Arial" w:cs="Arial" w:eastAsia="Arial" w:hAnsi="Arial"/>
+          <w:color w:val="333333"/>
+          <w:sz w:val="22"/>
+          <w:szCs w:val="22"/>
+        </w:rPr>
+        <w:t xml:space="preserve">Create new roles with a custom set of permission tags</w:t>
+      </w:r>
+    </w:p>
+    <w:p>
+      <w:pPr>
+        <w:pStyle w:val="ListParagraph"/>
+        <w:numPr>
+          <w:ilvl w:val="0"/>
+          <w:numId w:val="2"/>
+        </w:numPr>
+        <w:spacing w:after="100" w:line="300"/>
+      </w:pPr>
+      <w:r>
+        <w:rPr>
+          <w:rFonts w:ascii="Arial" w:cs="Arial" w:eastAsia="Arial" w:hAnsi="Arial"/>
+          <w:color w:val="333333"/>
+          <w:sz w:val="22"/>
+          <w:szCs w:val="22"/>
+        </w:rPr>
+        <w:t xml:space="preserve">Edit existing roles by toggling individual tags on or off</w:t>
+      </w:r>
+    </w:p>
+    <w:p>
+      <w:pPr>
+        <w:pStyle w:val="ListParagraph"/>
+        <w:numPr>
+          <w:ilvl w:val="0"/>
+          <w:numId w:val="2"/>
+        </w:numPr>
+        <w:spacing w:after="100" w:line="300"/>
+      </w:pPr>
+      <w:r>
+        <w:rPr>
+          <w:rFonts w:ascii="Arial" w:cs="Arial" w:eastAsia="Arial" w:hAnsi="Arial"/>
+          <w:color w:val="333333"/>
+          <w:sz w:val="22"/>
+          <w:szCs w:val="22"/>
+        </w:rPr>
+        <w:t xml:space="preserve">Override permissions for individual users — granting or revoking specific tags without changing the role definition itself</w:t>
+      </w:r>
+    </w:p>
+    <w:p>
+      <w:pPr>
+        <w:spacing w:after="180" w:line="320"/>
+      </w:pPr>
+      <w:r>
+        <w:rPr>
+          <w:rFonts w:ascii="Arial" w:cs="Arial" w:eastAsia="Arial" w:hAnsi="Arial"/>
+          <w:color w:val="333333"/>
+          <w:sz w:val="22"/>
+          <w:szCs w:val="22"/>
+        </w:rPr>
+        <w:t xml:space="preserve">Per-user overrides are useful when a single person needs a capability that their role does not normally include (for example, temporarily granting an AM the ability to approve submissions while Elena is on leave). Role definitions and user overrides are stored separately, so changes to a role automatically apply to all users in that role unless they have a personal override.</w:t>
+      </w:r>
+    </w:p>
+    <w:p>
+      <w:r>
+        <w:br w:type="page"/>
+      </w:r>
+    </w:p>
+    <w:p>
+      <w:pPr>
+        <w:pStyle w:val="Heading1"/>
+      </w:pPr>
+      <w:r>
+        <w:t xml:space="preserve">17. Glossary</w:t>
       </w:r>
     </w:p>
     <w:p>
@@ -4919,6 +5459,312 @@
           </w:p>
         </w:tc>
       </w:tr>
+      <w:tr>
+        <w:tc>
+          <w:tcPr>
+            <w:tcW w:type="dxa" w:w="2800"/>
+            <w:tcBorders>
+              <w:top w:val="single" w:color="CCCCCC" w:sz="1"/>
+              <w:left w:val="single" w:color="CCCCCC" w:sz="1"/>
+              <w:bottom w:val="single" w:color="CCCCCC" w:sz="1"/>
+              <w:right w:val="single" w:color="CCCCCC" w:sz="1"/>
+            </w:tcBorders>
+            <w:shd w:fill="F5F0F5" w:val="clear"/>
+            <w:tcMar>
+              <w:top w:type="dxa" w:w="60"/>
+              <w:left w:type="dxa" w:w="120"/>
+              <w:bottom w:type="dxa" w:w="60"/>
+              <w:right w:type="dxa" w:w="120"/>
+            </w:tcMar>
+          </w:tcPr>
+          <w:p>
+            <w:r>
+              <w:rPr>
+                <w:rFonts w:ascii="Arial" w:cs="Arial" w:eastAsia="Arial" w:hAnsi="Arial"/>
+                <w:b/>
+                <w:bCs/>
+                <w:color w:val="333333"/>
+                <w:sz w:val="20"/>
+                <w:szCs w:val="20"/>
+              </w:rPr>
+              <w:t xml:space="preserve">Permission Tag</w:t>
+            </w:r>
+          </w:p>
+        </w:tc>
+        <w:tc>
+          <w:tcPr>
+            <w:tcW w:type="dxa" w:w="6560"/>
+            <w:tcBorders>
+              <w:top w:val="single" w:color="CCCCCC" w:sz="1"/>
+              <w:left w:val="single" w:color="CCCCCC" w:sz="1"/>
+              <w:bottom w:val="single" w:color="CCCCCC" w:sz="1"/>
+              <w:right w:val="single" w:color="CCCCCC" w:sz="1"/>
+            </w:tcBorders>
+            <w:shd w:fill="F5F0F5" w:val="clear"/>
+            <w:tcMar>
+              <w:top w:type="dxa" w:w="60"/>
+              <w:left w:type="dxa" w:w="120"/>
+              <w:bottom w:type="dxa" w:w="60"/>
+              <w:right w:type="dxa" w:w="120"/>
+            </w:tcMar>
+          </w:tcPr>
+          <w:p>
+            <w:r>
+              <w:rPr>
+                <w:rFonts w:ascii="Arial" w:cs="Arial" w:eastAsia="Arial" w:hAnsi="Arial"/>
+                <w:color w:val="333333"/>
+                <w:sz w:val="20"/>
+                <w:szCs w:val="20"/>
+              </w:rPr>
+              <w:t xml:space="preserve">A granular access control flag (e.g. can-invoice, view-dashboard) assigned to roles or individual users to control what they can see and do</w:t>
+            </w:r>
+          </w:p>
+        </w:tc>
+      </w:tr>
+      <w:tr>
+        <w:tc>
+          <w:tcPr>
+            <w:tcW w:type="dxa" w:w="2800"/>
+            <w:tcBorders>
+              <w:top w:val="single" w:color="CCCCCC" w:sz="1"/>
+              <w:left w:val="single" w:color="CCCCCC" w:sz="1"/>
+              <w:bottom w:val="single" w:color="CCCCCC" w:sz="1"/>
+              <w:right w:val="single" w:color="CCCCCC" w:sz="1"/>
+            </w:tcBorders>
+            <w:tcMar>
+              <w:top w:type="dxa" w:w="60"/>
+              <w:left w:type="dxa" w:w="120"/>
+              <w:bottom w:type="dxa" w:w="60"/>
+              <w:right w:type="dxa" w:w="120"/>
+            </w:tcMar>
+          </w:tcPr>
+          <w:p>
+            <w:r>
+              <w:rPr>
+                <w:rFonts w:ascii="Arial" w:cs="Arial" w:eastAsia="Arial" w:hAnsi="Arial"/>
+                <w:b/>
+                <w:bCs/>
+                <w:color w:val="333333"/>
+                <w:sz w:val="20"/>
+                <w:szCs w:val="20"/>
+              </w:rPr>
+              <w:t xml:space="preserve">Role Management</w:t>
+            </w:r>
+          </w:p>
+        </w:tc>
+        <w:tc>
+          <w:tcPr>
+            <w:tcW w:type="dxa" w:w="6560"/>
+            <w:tcBorders>
+              <w:top w:val="single" w:color="CCCCCC" w:sz="1"/>
+              <w:left w:val="single" w:color="CCCCCC" w:sz="1"/>
+              <w:bottom w:val="single" w:color="CCCCCC" w:sz="1"/>
+              <w:right w:val="single" w:color="CCCCCC" w:sz="1"/>
+            </w:tcBorders>
+            <w:tcMar>
+              <w:top w:type="dxa" w:w="60"/>
+              <w:left w:type="dxa" w:w="120"/>
+              <w:bottom w:type="dxa" w:w="60"/>
+              <w:right w:type="dxa" w:w="120"/>
+            </w:tcMar>
+          </w:tcPr>
+          <w:p>
+            <w:r>
+              <w:rPr>
+                <w:rFonts w:ascii="Arial" w:cs="Arial" w:eastAsia="Arial" w:hAnsi="Arial"/>
+                <w:color w:val="333333"/>
+                <w:sz w:val="20"/>
+                <w:szCs w:val="20"/>
+              </w:rPr>
+              <w:t xml:space="preserve">The system screen where administrators create and edit roles, assign permission tags, and set per-user overrides</w:t>
+            </w:r>
+          </w:p>
+        </w:tc>
+      </w:tr>
+      <w:tr>
+        <w:tc>
+          <w:tcPr>
+            <w:tcW w:type="dxa" w:w="2800"/>
+            <w:tcBorders>
+              <w:top w:val="single" w:color="CCCCCC" w:sz="1"/>
+              <w:left w:val="single" w:color="CCCCCC" w:sz="1"/>
+              <w:bottom w:val="single" w:color="CCCCCC" w:sz="1"/>
+              <w:right w:val="single" w:color="CCCCCC" w:sz="1"/>
+            </w:tcBorders>
+            <w:shd w:fill="F5F0F5" w:val="clear"/>
+            <w:tcMar>
+              <w:top w:type="dxa" w:w="60"/>
+              <w:left w:type="dxa" w:w="120"/>
+              <w:bottom w:type="dxa" w:w="60"/>
+              <w:right w:type="dxa" w:w="120"/>
+            </w:tcMar>
+          </w:tcPr>
+          <w:p>
+            <w:r>
+              <w:rPr>
+                <w:rFonts w:ascii="Arial" w:cs="Arial" w:eastAsia="Arial" w:hAnsi="Arial"/>
+                <w:b/>
+                <w:bCs/>
+                <w:color w:val="333333"/>
+                <w:sz w:val="20"/>
+                <w:szCs w:val="20"/>
+              </w:rPr>
+              <w:t xml:space="preserve">Invoice Approval</w:t>
+            </w:r>
+          </w:p>
+        </w:tc>
+        <w:tc>
+          <w:tcPr>
+            <w:tcW w:type="dxa" w:w="6560"/>
+            <w:tcBorders>
+              <w:top w:val="single" w:color="CCCCCC" w:sz="1"/>
+              <w:left w:val="single" w:color="CCCCCC" w:sz="1"/>
+              <w:bottom w:val="single" w:color="CCCCCC" w:sz="1"/>
+              <w:right w:val="single" w:color="CCCCCC" w:sz="1"/>
+            </w:tcBorders>
+            <w:shd w:fill="F5F0F5" w:val="clear"/>
+            <w:tcMar>
+              <w:top w:type="dxa" w:w="60"/>
+              <w:left w:type="dxa" w:w="120"/>
+              <w:bottom w:type="dxa" w:w="60"/>
+              <w:right w:type="dxa" w:w="120"/>
+            </w:tcMar>
+          </w:tcPr>
+          <w:p>
+            <w:r>
+              <w:rPr>
+                <w:rFonts w:ascii="Arial" w:cs="Arial" w:eastAsia="Arial" w:hAnsi="Arial"/>
+                <w:color w:val="333333"/>
+                <w:sz w:val="20"/>
+                <w:szCs w:val="20"/>
+              </w:rPr>
+              <w:t xml:space="preserve">The workflow where accountant-generated invoices require Accounting Manager approval before being sent; manager-generated invoices are auto-approved</w:t>
+            </w:r>
+          </w:p>
+        </w:tc>
+      </w:tr>
+      <w:tr>
+        <w:tc>
+          <w:tcPr>
+            <w:tcW w:type="dxa" w:w="2800"/>
+            <w:tcBorders>
+              <w:top w:val="single" w:color="CCCCCC" w:sz="1"/>
+              <w:left w:val="single" w:color="CCCCCC" w:sz="1"/>
+              <w:bottom w:val="single" w:color="CCCCCC" w:sz="1"/>
+              <w:right w:val="single" w:color="CCCCCC" w:sz="1"/>
+            </w:tcBorders>
+            <w:tcMar>
+              <w:top w:type="dxa" w:w="60"/>
+              <w:left w:type="dxa" w:w="120"/>
+              <w:bottom w:type="dxa" w:w="60"/>
+              <w:right w:type="dxa" w:w="120"/>
+            </w:tcMar>
+          </w:tcPr>
+          <w:p>
+            <w:r>
+              <w:rPr>
+                <w:rFonts w:ascii="Arial" w:cs="Arial" w:eastAsia="Arial" w:hAnsi="Arial"/>
+                <w:b/>
+                <w:bCs/>
+                <w:color w:val="333333"/>
+                <w:sz w:val="20"/>
+                <w:szCs w:val="20"/>
+              </w:rPr>
+              <w:t xml:space="preserve">Transaction Ledger</w:t>
+            </w:r>
+          </w:p>
+        </w:tc>
+        <w:tc>
+          <w:tcPr>
+            <w:tcW w:type="dxa" w:w="6560"/>
+            <w:tcBorders>
+              <w:top w:val="single" w:color="CCCCCC" w:sz="1"/>
+              <w:left w:val="single" w:color="CCCCCC" w:sz="1"/>
+              <w:bottom w:val="single" w:color="CCCCCC" w:sz="1"/>
+              <w:right w:val="single" w:color="CCCCCC" w:sz="1"/>
+            </w:tcBorders>
+            <w:tcMar>
+              <w:top w:type="dxa" w:w="60"/>
+              <w:left w:type="dxa" w:w="120"/>
+              <w:bottom w:type="dxa" w:w="60"/>
+              <w:right w:type="dxa" w:w="120"/>
+            </w:tcMar>
+          </w:tcPr>
+          <w:p>
+            <w:r>
+              <w:rPr>
+                <w:rFonts w:ascii="Arial" w:cs="Arial" w:eastAsia="Arial" w:hAnsi="Arial"/>
+                <w:color w:val="333333"/>
+                <w:sz w:val="20"/>
+                <w:szCs w:val="20"/>
+              </w:rPr>
+              <w:t xml:space="preserve">A chronological record of all debits (government fee payments) and credits (top-ups) on a specific company card, with running balance</w:t>
+            </w:r>
+          </w:p>
+        </w:tc>
+      </w:tr>
+      <w:tr>
+        <w:tc>
+          <w:tcPr>
+            <w:tcW w:type="dxa" w:w="2800"/>
+            <w:tcBorders>
+              <w:top w:val="single" w:color="CCCCCC" w:sz="1"/>
+              <w:left w:val="single" w:color="CCCCCC" w:sz="1"/>
+              <w:bottom w:val="single" w:color="CCCCCC" w:sz="1"/>
+              <w:right w:val="single" w:color="CCCCCC" w:sz="1"/>
+            </w:tcBorders>
+            <w:shd w:fill="F5F0F5" w:val="clear"/>
+            <w:tcMar>
+              <w:top w:type="dxa" w:w="60"/>
+              <w:left w:type="dxa" w:w="120"/>
+              <w:bottom w:type="dxa" w:w="60"/>
+              <w:right w:type="dxa" w:w="120"/>
+            </w:tcMar>
+          </w:tcPr>
+          <w:p>
+            <w:r>
+              <w:rPr>
+                <w:rFonts w:ascii="Arial" w:cs="Arial" w:eastAsia="Arial" w:hAnsi="Arial"/>
+                <w:b/>
+                <w:bCs/>
+                <w:color w:val="333333"/>
+                <w:sz w:val="20"/>
+                <w:szCs w:val="20"/>
+              </w:rPr>
+              <w:t xml:space="preserve">Client Onboarding</w:t>
+            </w:r>
+          </w:p>
+        </w:tc>
+        <w:tc>
+          <w:tcPr>
+            <w:tcW w:type="dxa" w:w="6560"/>
+            <w:tcBorders>
+              <w:top w:val="single" w:color="CCCCCC" w:sz="1"/>
+              <w:left w:val="single" w:color="CCCCCC" w:sz="1"/>
+              <w:bottom w:val="single" w:color="CCCCCC" w:sz="1"/>
+              <w:right w:val="single" w:color="CCCCCC" w:sz="1"/>
+            </w:tcBorders>
+            <w:shd w:fill="F5F0F5" w:val="clear"/>
+            <w:tcMar>
+              <w:top w:type="dxa" w:w="60"/>
+              <w:left w:type="dxa" w:w="120"/>
+              <w:bottom w:type="dxa" w:w="60"/>
+              <w:right w:type="dxa" w:w="120"/>
+            </w:tcMar>
+          </w:tcPr>
+          <w:p>
+            <w:r>
+              <w:rPr>
+                <w:rFonts w:ascii="Arial" w:cs="Arial" w:eastAsia="Arial" w:hAnsi="Arial"/>
+                <w:color w:val="333333"/>
+                <w:sz w:val="20"/>
+                <w:szCs w:val="20"/>
+              </w:rPr>
+              <w:t xml:space="preserve">The step-by-step wizard used by Account Managers to register a new client in the system, collecting all required details including company, type, credit limit, and contract dates</w:t>
+            </w:r>
+          </w:p>
+        </w:tc>
+      </w:tr>
     </w:tbl>
     <w:p>
       <w:pPr>

</xml_diff>